<commit_message>
docs: focus week one on class circuit decode and ALU
</commit_message>
<xml_diff>
--- a/docs/reports/weekly/week-01-2026-10-21.docx
+++ b/docs/reports/weekly/week-01-2026-10-21.docx
@@ -15,22 +15,17 @@
         <w:pStyle w:val="Subtitle"/>
       </w:pPr>
       <w:r>
-        <w:t>Kỳ báo cáo: 21–27/10/2026  •  Cập nhật: 25/10/2026  •  Bản nháp</w:t>
+        <w:t>21–27/10/2026 • Cập nhật 26/10/2026 • Bản nháp giữa tuần</w:t>
       </w:r>
     </w:p>
     <w:p>
       <w:r>
-        <w:t>Học viên: Nguyễn Hải Minh     |     GVHD: [Bổ sung]</w:t>
+        <w:t>Học viên: Nguyễn Hải Minh    |    GVHD: [Bổ sung]</w:t>
       </w:r>
     </w:p>
     <w:p>
       <w:r>
-        <w:t>Hướng đề tài: xây dựng baseline SoC RISC-V Ibex trên FPGA. Tên đề tài chính thức: [Bổ sung].</w:t>
-      </w:r>
-    </w:p>
-    <w:p>
-      <w:r>
-        <w:t>Bản nháp giữa tuần để học viên rà soát. Chỉ ghi nhận kết quả có thông tin xác nhận; các nội dung dự kiến học không được tính là đã hoàn thành.</w:t>
+        <w:t>Hướng đề tài: học và nghiên cứu các khối kiến trúc RISC-V từ mô hình lớp Kiến trúc máy tính tiên tiến, liên hệ triển khai core Ibex. Tên đề tài chính thức: [Bổ sung].</w:t>
       </w:r>
     </w:p>
     <w:p>
@@ -63,13 +58,13 @@
           </w:tcPr>
           <w:p>
             <w:pPr>
-              <w:spacing w:after="80"/>
+              <w:spacing w:after="60"/>
             </w:pPr>
             <w:r>
               <w:rPr>
                 <w:sz w:val="20"/>
               </w:rPr>
-              <w:t>Mục tiêu tuần</w:t>
+              <w:t>Mục tiêu</w:t>
             </w:r>
           </w:p>
         </w:tc>
@@ -79,13 +74,13 @@
           </w:tcPr>
           <w:p>
             <w:pPr>
-              <w:spacing w:after="80"/>
+              <w:spacing w:after="60"/>
             </w:pPr>
             <w:r>
               <w:rPr>
                 <w:sz w:val="20"/>
               </w:rPr>
-              <w:t>Kết quả ghi nhận</w:t>
+              <w:t>Kết quả đến thời điểm cập nhật</w:t>
             </w:r>
           </w:p>
         </w:tc>
@@ -95,13 +90,13 @@
           </w:tcPr>
           <w:p>
             <w:pPr>
-              <w:spacing w:after="80"/>
+              <w:spacing w:after="60"/>
             </w:pPr>
             <w:r>
               <w:rPr>
                 <w:sz w:val="20"/>
               </w:rPr>
-              <w:t>Phần cần hoàn thiện</w:t>
+              <w:t>Bằng chứng / giới hạn</w:t>
             </w:r>
           </w:p>
         </w:tc>
@@ -116,13 +111,13 @@
           </w:tcPr>
           <w:p>
             <w:pPr>
-              <w:spacing w:after="80"/>
+              <w:spacing w:after="60"/>
             </w:pPr>
             <w:r>
               <w:rPr>
                 <w:sz w:val="20"/>
               </w:rPr>
-              <w:t>Xác định phạm vi Phase 1</w:t>
+              <w:t>Chọn điểm xuất phát sát môn học</w:t>
             </w:r>
           </w:p>
         </w:tc>
@@ -132,13 +127,13 @@
           </w:tcPr>
           <w:p>
             <w:pPr>
-              <w:spacing w:after="80"/>
+              <w:spacing w:after="60"/>
             </w:pPr>
             <w:r>
               <w:rPr>
                 <w:sz w:val="20"/>
               </w:rPr>
-              <w:t>Có định hướng Ibex SoC, firmware C và UART/GPIO/timer/debug trong kế hoạch dự án.</w:t>
+              <w:t>Học viên cung cấp RiscVComputer_T3.circ và xác định học theo các khối kiến trúc.</w:t>
             </w:r>
           </w:p>
         </w:tc>
@@ -148,13 +143,13 @@
           </w:tcPr>
           <w:p>
             <w:pPr>
-              <w:spacing w:after="80"/>
+              <w:spacing w:after="60"/>
             </w:pPr>
             <w:r>
               <w:rPr>
                 <w:sz w:val="20"/>
               </w:rPr>
-              <w:t>Đối chiếu mục tiêu với GVHD; chưa có baseline thực nghiệm.</w:t>
+              <w:t>File gốc do học viên tải lên; chưa sửa hoặc chạy mô phỏng trong phiên hỗ trợ.</w:t>
             </w:r>
           </w:p>
         </w:tc>
@@ -169,13 +164,13 @@
           </w:tcPr>
           <w:p>
             <w:pPr>
-              <w:spacing w:after="80"/>
+              <w:spacing w:after="60"/>
             </w:pPr>
             <w:r>
               <w:rPr>
                 <w:sz w:val="20"/>
               </w:rPr>
-              <w:t>Tổ chức học kiến thức phục vụ đồ án</w:t>
+              <w:t>Khảo sát thiết kế hiện có</w:t>
             </w:r>
           </w:p>
         </w:tc>
@@ -185,13 +180,13 @@
           </w:tcPr>
           <w:p>
             <w:pPr>
-              <w:spacing w:after="80"/>
+              <w:spacing w:after="60"/>
             </w:pPr>
             <w:r>
               <w:rPr>
                 <w:sz w:val="20"/>
               </w:rPr>
-              <w:t>Đã thống nhất dùng sách Computer Architecture trong Tài liệu Project làm nguồn nền tảng; đã có bài học dự án đầu tiên.</w:t>
+              <w:t>Agent đã đọc cấu trúc main, InstructionDecode, RegisterFile, ALU, ImmGen và ROM lệnh.</w:t>
             </w:r>
           </w:p>
         </w:tc>
@@ -201,13 +196,13 @@
           </w:tcPr>
           <w:p>
             <w:pPr>
-              <w:spacing w:after="80"/>
+              <w:spacing w:after="60"/>
             </w:pPr>
             <w:r>
               <w:rPr>
                 <w:sz w:val="20"/>
               </w:rPr>
-              <w:t>Học viên học, giải thích lại và làm bài tập; chưa ghi nhận hoàn tất CA01.</w:t>
+              <w:t>Đọc source XML; chưa là kết quả thực hành của học viên.</w:t>
             </w:r>
           </w:p>
         </w:tc>
@@ -222,13 +217,13 @@
           </w:tcPr>
           <w:p>
             <w:pPr>
-              <w:spacing w:after="80"/>
+              <w:spacing w:after="60"/>
             </w:pPr>
             <w:r>
               <w:rPr>
                 <w:sz w:val="20"/>
               </w:rPr>
-              <w:t>Chuẩn bị cơ chế báo cáo hằng tuần</w:t>
+              <w:t>Thu hẹp nội dung W1</w:t>
             </w:r>
           </w:p>
         </w:tc>
@@ -238,13 +233,13 @@
           </w:tcPr>
           <w:p>
             <w:pPr>
-              <w:spacing w:after="80"/>
+              <w:spacing w:after="60"/>
             </w:pPr>
             <w:r>
               <w:rPr>
                 <w:sz w:val="20"/>
               </w:rPr>
-              <w:t>Có báo cáo Word tuần 1 và mẫu Word dùng lại.</w:t>
+              <w:t>Chọn Decode và ALU; register file dùng làm cầu nối, memory để bước tiếp theo.</w:t>
             </w:r>
           </w:p>
         </w:tc>
@@ -254,13 +249,13 @@
           </w:tcPr>
           <w:p>
             <w:pPr>
-              <w:spacing w:after="80"/>
+              <w:spacing w:after="60"/>
             </w:pPr>
             <w:r>
               <w:rPr>
                 <w:sz w:val="20"/>
               </w:rPr>
-              <w:t>Bổ sung kết quả học/thực hành thực tế trước khi chốt báo cáo.</w:t>
+              <w:t>Có bài Word gồm bảng trường lệnh, ví dụ từ ROM, control subset và vector expected.</w:t>
             </w:r>
           </w:p>
         </w:tc>
@@ -275,13 +270,13 @@
           </w:tcPr>
           <w:p>
             <w:pPr>
-              <w:spacing w:after="80"/>
+              <w:spacing w:after="60"/>
             </w:pPr>
             <w:r>
               <w:rPr>
                 <w:sz w:val="20"/>
               </w:rPr>
-              <w:t>Có bằng chứng mô phỏng/FPGA</w:t>
+              <w:t>Đối chiếu core RISC-V thực</w:t>
             </w:r>
           </w:p>
         </w:tc>
@@ -291,13 +286,13 @@
           </w:tcPr>
           <w:p>
             <w:pPr>
-              <w:spacing w:after="80"/>
+              <w:spacing w:after="60"/>
             </w:pPr>
             <w:r>
               <w:rPr>
                 <w:sz w:val="20"/>
               </w:rPr>
-              <w:t>Chưa ghi nhận log hoặc kết quả thực nghiệm do học viên cung cấp.</w:t>
+              <w:t>Đã đọc các đoạn decoder, ALU và giao diện register file của Ibex tại revision cố định.</w:t>
             </w:r>
           </w:p>
         </w:tc>
@@ -307,13 +302,13 @@
           </w:tcPr>
           <w:p>
             <w:pPr>
-              <w:spacing w:after="80"/>
+              <w:spacing w:after="60"/>
             </w:pPr>
             <w:r>
               <w:rPr>
                 <w:sz w:val="20"/>
               </w:rPr>
-              <w:t>Chỉ cập nhật sau khi có kết quả thực tế; không suy ra từ kế hoạch.</w:t>
+              <w:t>Source inspection, chưa build/simulation và chưa xác nhận học viên đã hiểu.</w:t>
             </w:r>
           </w:p>
         </w:tc>
@@ -325,17 +320,40 @@
         <w:pStyle w:val="Heading1"/>
       </w:pPr>
       <w:r>
-        <w:t>2. Nội dung học và đầu ra</w:t>
+        <w:t>2. Nội dung học và kết quả cần bổ sung</w:t>
       </w:r>
     </w:p>
     <w:p>
       <w:r>
-        <w:t>Chủ đề buổi đầu: chương trình C → lệnh máy → CPU thực thi → bộ nhớ/ngoại vi. Mục tiêu là hiểu vai trò ISA, vi kiến trúc, SoC và FPGA trong chính hệ thống đang xây dựng.</w:t>
+        <w:t>Decode: phân biệt tách trường với sinh điều khiển; opcode/funct3/funct7, số hiệu thanh ghi, sign-extension; bảng ADD/SUB/ADDI. ALU: cộng/trừ 32-bit, số bù hai, chọn toán hạng và phép tính, đường write-back.</w:t>
       </w:r>
     </w:p>
     <w:p>
       <w:r>
-        <w:t>Tài liệu hỗ trợ: “W1 — Bài 1: Từ chương trình đến SoC Ibex” (Word). Quy tắc lệnh được đối chiếu với đặc tả RISC-V; chức năng hệ thống tham chiếu đối chiếu README Ibex Demo System. Chưa gán chương/trang cho sách khi chưa đọc được file sách trong phiên này.</w:t>
+        <w:t>Ví dụ bám file lớp: ROM có 0x00C48993 = ADDI x19,x9,12 và 0x00208663 = BEQ x1,x2,+12. Đây là giải mã theo ISA, chưa phải output quan sát trên mạch. Phần control đề xuất hiện chỉ nhắm ADD/SUB/ADDI, chưa hỗ trợ branch.</w:t>
+      </w:r>
+    </w:p>
+    <w:p>
+      <w:r>
+        <w:t>Kết quả học viên tự xác nhận: [Bổ sung sơ đồ, bảng control, mã ALUCtrl lần từ MUX, lời giải]. Kết quả mô phỏng: [Bổ sung expected/actual và ảnh sau khi thực hiện]. Chưa ghi nhận hoàn tất CA01 hay phát triển thành công mô hình.</w:t>
+      </w:r>
+    </w:p>
+    <w:p>
+      <w:r>
+        <w:br w:type="page"/>
+      </w:r>
+    </w:p>
+    <w:p>
+      <w:pPr>
+        <w:pStyle w:val="Heading1"/>
+      </w:pPr>
+      <w:r>
+        <w:t>3. Vấn đề kỹ thuật và hướng xử lý</w:t>
+      </w:r>
+    </w:p>
+    <w:p>
+      <w:r>
+        <w:t>Các mục dưới là câu hỏi thiết kế đã xác định từ khảo sát, chưa phải khó khăn học viên đã tự kiểm chứng. Khó khăn thực tế trong quá trình học: [Bổ sung].</w:t>
       </w:r>
     </w:p>
     <w:tbl>
@@ -345,8 +363,9 @@
         <w:tblLook w:firstColumn="1" w:firstRow="1" w:lastColumn="0" w:lastRow="0" w:noHBand="0" w:noVBand="1" w:val="04A0"/>
       </w:tblPr>
       <w:tblGrid>
-        <w:gridCol w:w="4819"/>
-        <w:gridCol w:w="4819"/>
+        <w:gridCol w:w="3213"/>
+        <w:gridCol w:w="3213"/>
+        <w:gridCol w:w="3213"/>
       </w:tblGrid>
       <w:tr>
         <w:trPr>
@@ -355,33 +374,49 @@
         </w:trPr>
         <w:tc>
           <w:tcPr>
-            <w:tcW w:type="dxa" w:w="4819"/>
+            <w:tcW w:type="dxa" w:w="3213"/>
           </w:tcPr>
           <w:p>
             <w:pPr>
-              <w:spacing w:after="80"/>
+              <w:spacing w:after="60"/>
             </w:pPr>
             <w:r>
               <w:rPr>
                 <w:sz w:val="20"/>
               </w:rPr>
-              <w:t>Đầu ra học tập</w:t>
+              <w:t>Điểm cần làm rõ</w:t>
             </w:r>
           </w:p>
         </w:tc>
         <w:tc>
           <w:tcPr>
-            <w:tcW w:type="dxa" w:w="4819"/>
+            <w:tcW w:type="dxa" w:w="3213"/>
           </w:tcPr>
           <w:p>
             <w:pPr>
-              <w:spacing w:after="80"/>
+              <w:spacing w:after="60"/>
             </w:pPr>
             <w:r>
               <w:rPr>
                 <w:sz w:val="20"/>
               </w:rPr>
-              <w:t>Kết quả học viên xác nhận</w:t>
+              <w:t>Ảnh hưởng / ý nghĩa</w:t>
+            </w:r>
+          </w:p>
+        </w:tc>
+        <w:tc>
+          <w:tcPr>
+            <w:tcW w:type="dxa" w:w="3213"/>
+          </w:tcPr>
+          <w:p>
+            <w:pPr>
+              <w:spacing w:after="60"/>
+            </w:pPr>
+            <w:r>
+              <w:rPr>
+                <w:sz w:val="20"/>
+              </w:rPr>
+              <w:t>Hướng xử lý dự kiến</w:t>
             </w:r>
           </w:p>
         </w:tc>
@@ -392,33 +427,49 @@
         </w:trPr>
         <w:tc>
           <w:tcPr>
-            <w:tcW w:type="dxa" w:w="4819"/>
+            <w:tcW w:type="dxa" w:w="3213"/>
           </w:tcPr>
           <w:p>
             <w:pPr>
-              <w:spacing w:after="80"/>
+              <w:spacing w:after="60"/>
             </w:pPr>
             <w:r>
               <w:rPr>
                 <w:sz w:val="20"/>
               </w:rPr>
-              <w:t>Sơ đồ CPU–memory–I/O và vai trò từng khối</w:t>
+              <w:t>InstructionDecode là bộ tách bit; control trong main còn bằng Pin</w:t>
             </w:r>
           </w:p>
         </w:tc>
         <w:tc>
           <w:tcPr>
-            <w:tcW w:type="dxa" w:w="4819"/>
+            <w:tcW w:type="dxa" w:w="3213"/>
           </w:tcPr>
           <w:p>
             <w:pPr>
-              <w:spacing w:after="80"/>
+              <w:spacing w:after="60"/>
             </w:pPr>
             <w:r>
               <w:rPr>
                 <w:sz w:val="20"/>
               </w:rPr>
-              <w:t>[Bổ sung sau buổi học]</w:t>
+              <w:t>Có trường lệnh chưa đủ để tự thực thi đúng lệnh.</w:t>
+            </w:r>
+          </w:p>
+        </w:tc>
+        <w:tc>
+          <w:tcPr>
+            <w:tcW w:type="dxa" w:w="3213"/>
+          </w:tcPr>
+          <w:p>
+            <w:pPr>
+              <w:spacing w:after="60"/>
+            </w:pPr>
+            <w:r>
+              <w:rPr>
+                <w:sz w:val="20"/>
+              </w:rPr>
+              <w:t>Lập bảng control ADD/SUB/ADDI, kiểm thử riêng rồi phát triển ControlALU.</w:t>
             </w:r>
           </w:p>
         </w:tc>
@@ -429,33 +480,49 @@
         </w:trPr>
         <w:tc>
           <w:tcPr>
-            <w:tcW w:type="dxa" w:w="4819"/>
+            <w:tcW w:type="dxa" w:w="3213"/>
           </w:tcPr>
           <w:p>
             <w:pPr>
-              <w:spacing w:after="80"/>
+              <w:spacing w:after="60"/>
             </w:pPr>
             <w:r>
               <w:rPr>
                 <w:sz w:val="20"/>
               </w:rPr>
-              <w:t>Bảng trước/sau của ví dụ ADDI và store</w:t>
+              <w:t>ALUCtrl là mã nội bộ, không phải opcode ISA</w:t>
             </w:r>
           </w:p>
         </w:tc>
         <w:tc>
           <w:tcPr>
-            <w:tcW w:type="dxa" w:w="4819"/>
+            <w:tcW w:type="dxa" w:w="3213"/>
           </w:tcPr>
           <w:p>
             <w:pPr>
-              <w:spacing w:after="80"/>
+              <w:spacing w:after="60"/>
             </w:pPr>
             <w:r>
               <w:rPr>
                 <w:sz w:val="20"/>
               </w:rPr>
-              <w:t>[Bổ sung lời giải và lỗi đã sửa]</w:t>
+              <w:t>Nhầm mã có thể chọn sai phép tính dù dữ liệu đúng.</w:t>
+            </w:r>
+          </w:p>
+        </w:tc>
+        <w:tc>
+          <w:tcPr>
+            <w:tcW w:type="dxa" w:w="3213"/>
+          </w:tcPr>
+          <w:p>
+            <w:pPr>
+              <w:spacing w:after="60"/>
+            </w:pPr>
+            <w:r>
+              <w:rPr>
+                <w:sz w:val="20"/>
+              </w:rPr>
+              <w:t>Lần dây MUX, ghi bảng mã thật; đối chiếu Ibex theo chức năng thay vì sao chép enum.</w:t>
             </w:r>
           </w:p>
         </w:tc>
@@ -466,135 +533,49 @@
         </w:trPr>
         <w:tc>
           <w:tcPr>
-            <w:tcW w:type="dxa" w:w="4819"/>
+            <w:tcW w:type="dxa" w:w="3213"/>
           </w:tcPr>
           <w:p>
             <w:pPr>
-              <w:spacing w:after="80"/>
+              <w:spacing w:after="60"/>
             </w:pPr>
             <w:r>
               <w:rPr>
                 <w:sz w:val="20"/>
               </w:rPr>
-              <w:t>Giải thích firmware khác bitstream; ISA khác pipeline</w:t>
+              <w:t>Các vị trí bit đổi ý nghĩa theo dạng lệnh</w:t>
             </w:r>
           </w:p>
         </w:tc>
         <w:tc>
           <w:tcPr>
-            <w:tcW w:type="dxa" w:w="4819"/>
+            <w:tcW w:type="dxa" w:w="3213"/>
           </w:tcPr>
           <w:p>
             <w:pPr>
-              <w:spacing w:after="80"/>
+              <w:spacing w:after="60"/>
             </w:pPr>
             <w:r>
               <w:rPr>
                 <w:sz w:val="20"/>
               </w:rPr>
-              <w:t>[Bổ sung bằng lời của học viên]</w:t>
+              <w:t>ADDI không dùng rs2; BEQ không ghi rd.</w:t>
             </w:r>
           </w:p>
         </w:tc>
-      </w:tr>
-    </w:tbl>
-    <w:p/>
-    <w:p>
-      <w:r>
-        <w:br w:type="page"/>
-      </w:r>
-    </w:p>
-    <w:p>
-      <w:pPr>
-        <w:pStyle w:val="Heading1"/>
-      </w:pPr>
-      <w:r>
-        <w:t>3. Khó khăn, vấn đề và giải pháp</w:t>
-      </w:r>
-    </w:p>
-    <w:p>
-      <w:r>
-        <w:t>Chưa có khó khăn chuyên môn cụ thể do học viên xác nhận. Bảng dưới dùng để bổ sung vấn đề thực tế phát sinh trong quá trình học và thực hiện đồ án, kèm nguyên nhân, giải pháp đã thử và kết quả.</w:t>
-      </w:r>
-    </w:p>
-    <w:tbl>
-      <w:tblPr>
-        <w:tblStyle w:val="LightShading-Accent1"/>
-        <w:tblW w:type="auto" w:w="0"/>
-        <w:tblLook w:firstColumn="1" w:firstRow="1" w:lastColumn="0" w:lastRow="0" w:noHBand="0" w:noVBand="1" w:val="04A0"/>
-      </w:tblPr>
-      <w:tblGrid>
-        <w:gridCol w:w="2409"/>
-        <w:gridCol w:w="2409"/>
-        <w:gridCol w:w="2409"/>
-        <w:gridCol w:w="2409"/>
-      </w:tblGrid>
-      <w:tr>
-        <w:trPr>
-          <w:cantSplit/>
-          <w:tblHeader/>
-        </w:trPr>
         <w:tc>
           <w:tcPr>
-            <w:tcW w:type="dxa" w:w="2409"/>
+            <w:tcW w:type="dxa" w:w="3213"/>
           </w:tcPr>
           <w:p>
             <w:pPr>
-              <w:spacing w:after="80"/>
+              <w:spacing w:after="60"/>
             </w:pPr>
             <w:r>
               <w:rPr>
                 <w:sz w:val="20"/>
               </w:rPr>
-              <w:t>Vấn đề thực tế</w:t>
-            </w:r>
-          </w:p>
-        </w:tc>
-        <w:tc>
-          <w:tcPr>
-            <w:tcW w:type="dxa" w:w="2409"/>
-          </w:tcPr>
-          <w:p>
-            <w:pPr>
-              <w:spacing w:after="80"/>
-            </w:pPr>
-            <w:r>
-              <w:rPr>
-                <w:sz w:val="20"/>
-              </w:rPr>
-              <w:t>Nguyên nhân / ảnh hưởng</w:t>
-            </w:r>
-          </w:p>
-        </w:tc>
-        <w:tc>
-          <w:tcPr>
-            <w:tcW w:type="dxa" w:w="2409"/>
-          </w:tcPr>
-          <w:p>
-            <w:pPr>
-              <w:spacing w:after="80"/>
-            </w:pPr>
-            <w:r>
-              <w:rPr>
-                <w:sz w:val="20"/>
-              </w:rPr>
-              <w:t>Đã xử lý và kết quả</w:t>
-            </w:r>
-          </w:p>
-        </w:tc>
-        <w:tc>
-          <w:tcPr>
-            <w:tcW w:type="dxa" w:w="2409"/>
-          </w:tcPr>
-          <w:p>
-            <w:pPr>
-              <w:spacing w:after="80"/>
-            </w:pPr>
-            <w:r>
-              <w:rPr>
-                <w:sz w:val="20"/>
-              </w:rPr>
-              <w:t>Bước tiếp theo</w:t>
+              <w:t>Giải mã ba dạng ví dụ, đặt Write=0 với lệnh chưa hỗ trợ trong bản thử subset.</w:t>
             </w:r>
           </w:p>
         </w:tc>
@@ -605,65 +586,49 @@
         </w:trPr>
         <w:tc>
           <w:tcPr>
-            <w:tcW w:type="dxa" w:w="2409"/>
+            <w:tcW w:type="dxa" w:w="3213"/>
           </w:tcPr>
           <w:p>
             <w:pPr>
-              <w:spacing w:after="80"/>
+              <w:spacing w:after="60"/>
             </w:pPr>
             <w:r>
               <w:rPr>
                 <w:sz w:val="20"/>
               </w:rPr>
-              <w:t>[Học viên bổ sung]</w:t>
+              <w:t>ROM có branch, chưa thấy RAM dữ liệu riêng</w:t>
             </w:r>
           </w:p>
         </w:tc>
         <w:tc>
           <w:tcPr>
-            <w:tcW w:type="dxa" w:w="2409"/>
+            <w:tcW w:type="dxa" w:w="3213"/>
           </w:tcPr>
           <w:p>
             <w:pPr>
-              <w:spacing w:after="80"/>
+              <w:spacing w:after="60"/>
             </w:pPr>
             <w:r>
               <w:rPr>
                 <w:sz w:val="20"/>
               </w:rPr>
-              <w:t>[Đã xác nhận hay giả thuyết?]</w:t>
+              <w:t>Chưa đủ cơ sở khẳng định chạy được cả ROM hay hỗ trợ load/store.</w:t>
             </w:r>
           </w:p>
         </w:tc>
         <w:tc>
           <w:tcPr>
-            <w:tcW w:type="dxa" w:w="2409"/>
+            <w:tcW w:type="dxa" w:w="3213"/>
           </w:tcPr>
           <w:p>
             <w:pPr>
-              <w:spacing w:after="80"/>
+              <w:spacing w:after="60"/>
             </w:pPr>
             <w:r>
               <w:rPr>
                 <w:sz w:val="20"/>
               </w:rPr>
-              <w:t>[Giải pháp đã thử; kết quả thật]</w:t>
-            </w:r>
-          </w:p>
-        </w:tc>
-        <w:tc>
-          <w:tcPr>
-            <w:tcW w:type="dxa" w:w="2409"/>
-          </w:tcPr>
-          <w:p>
-            <w:pPr>
-              <w:spacing w:after="80"/>
-            </w:pPr>
-            <w:r>
-              <w:rPr>
-                <w:sz w:val="20"/>
-              </w:rPr>
-              <w:t>[Việc cụ thể, đầu ra cần có]</w:t>
+              <w:t>Dùng bộ lệnh thử đúng subset; học control branch và data memory ở bước sau.</w:t>
             </w:r>
           </w:p>
         </w:tc>
@@ -679,32 +644,13 @@
       </w:r>
     </w:p>
     <w:p>
-      <w:pPr>
-        <w:pStyle w:val="ListBullet"/>
-      </w:pPr>
       <w:r>
-        <w:t>Phân biệt ISA và vi kiến trúc giúp tách yêu cầu đúng hành vi chương trình khỏi lựa chọn tổ chức phần cứng. Chưa kết luận số chu kỳ hoặc hiệu năng khi chưa có cấu hình và phép đo.</w:t>
-      </w:r>
-    </w:p>
-    <w:p>
-      <w:pPr>
-        <w:pStyle w:val="ListBullet"/>
-      </w:pPr>
-      <w:r>
-        <w:t>Phân biệt core và SoC xác định phần phải tích hợp ngoài Ibex: bộ nhớ, kết nối, ngoại vi và debug. Dùng Demo System làm ứng viên baseline theo ADR-0002; chưa chứng minh đây là phương án tối ưu.</w:t>
-      </w:r>
-    </w:p>
-    <w:p>
-      <w:pPr>
-        <w:pStyle w:val="ListBullet"/>
-      </w:pPr>
-      <w:r>
-        <w:t>Phân biệt firmware và bitstream giúp xác định đúng sản phẩm cần thay đổi khi sửa chương trình hoặc RTL. Cách nạp chương trình phụ thuộc cấu hình thực tế.</w:t>
+        <w:t>Mô hình lớp cho phép thấy trực tiếp quan hệ giữa instruction, control và datapath. Decode đúng phải chọn đúng nguồn dữ liệu, phép ALU và điều kiện ghi; ALU đúng riêng lẻ chưa bảo đảm đường thực thi đúng. So sánh với Ibex giúp phân biệt yêu cầu ISA với lựa chọn implementation, chuẩn bị cho đọc RTL và kiểm chứng sau này.</w:t>
       </w:r>
     </w:p>
     <w:p>
       <w:r>
-        <w:t>Các ý trên là nội dung để trao đổi và kiểm chứng trong bài học. Nhận xét riêng của học viên sau khi học: [Bổ sung].</w:t>
+        <w:t>Hướng phát triển hiện tại là mở rộng có kiểm soát mô hình lớp theo từng khối; chưa thay core vendored của baseline Ibex, chưa kết luận đạt timing/hiệu năng hoặc hoàn thành CPU.</w:t>
       </w:r>
     </w:p>
     <w:p>
@@ -737,7 +683,7 @@
           </w:tcPr>
           <w:p>
             <w:pPr>
-              <w:spacing w:after="80"/>
+              <w:spacing w:after="60"/>
             </w:pPr>
             <w:r>
               <w:rPr>
@@ -753,7 +699,7 @@
           </w:tcPr>
           <w:p>
             <w:pPr>
-              <w:spacing w:after="80"/>
+              <w:spacing w:after="60"/>
             </w:pPr>
             <w:r>
               <w:rPr>
@@ -769,13 +715,13 @@
           </w:tcPr>
           <w:p>
             <w:pPr>
-              <w:spacing w:after="80"/>
+              <w:spacing w:after="60"/>
             </w:pPr>
             <w:r>
               <w:rPr>
                 <w:sz w:val="20"/>
               </w:rPr>
-              <w:t>Đầu ra / tiêu chí hoàn thành</w:t>
+              <w:t>Đầu ra</w:t>
             </w:r>
           </w:p>
         </w:tc>
@@ -790,13 +736,13 @@
           </w:tcPr>
           <w:p>
             <w:pPr>
-              <w:spacing w:after="80"/>
+              <w:spacing w:after="60"/>
             </w:pPr>
             <w:r>
               <w:rPr>
                 <w:sz w:val="20"/>
               </w:rPr>
-              <w:t>1 · Nền tảng kiến trúc</w:t>
+              <w:t>1</w:t>
             </w:r>
           </w:p>
         </w:tc>
@@ -806,13 +752,13 @@
           </w:tcPr>
           <w:p>
             <w:pPr>
-              <w:spacing w:after="80"/>
+              <w:spacing w:after="60"/>
             </w:pPr>
             <w:r>
               <w:rPr>
                 <w:sz w:val="20"/>
               </w:rPr>
-              <w:t>Hoàn thiện bài đầu; học tiếp register, ALU, load/store và đường dữ liệu theo tiến độ hiểu thực tế.</w:t>
+              <w:t>Hoàn thiện Decode/ALU còn lại theo mức hiểu thực tế.</w:t>
             </w:r>
           </w:p>
         </w:tc>
@@ -822,13 +768,13 @@
           </w:tcPr>
           <w:p>
             <w:pPr>
-              <w:spacing w:after="80"/>
+              <w:spacing w:after="60"/>
             </w:pPr>
             <w:r>
               <w:rPr>
                 <w:sz w:val="20"/>
               </w:rPr>
-              <w:t>Sơ đồ tự giải thích; bài trace có lời giải, được review.</w:t>
+              <w:t>Bảng control, 8 vector ALU có expected/actual; phát triển trên bản sao của file lớp.</w:t>
             </w:r>
           </w:p>
         </w:tc>
@@ -843,13 +789,13 @@
           </w:tcPr>
           <w:p>
             <w:pPr>
-              <w:spacing w:after="80"/>
+              <w:spacing w:after="60"/>
             </w:pPr>
             <w:r>
               <w:rPr>
                 <w:sz w:val="20"/>
               </w:rPr>
-              <w:t>2 · Phần mềm trên SoC</w:t>
+              <w:t>2</w:t>
             </w:r>
           </w:p>
         </w:tc>
@@ -859,13 +805,13 @@
           </w:tcPr>
           <w:p>
             <w:pPr>
-              <w:spacing w:after="80"/>
+              <w:spacing w:after="60"/>
             </w:pPr>
             <w:r>
               <w:rPr>
                 <w:sz w:val="20"/>
               </w:rPr>
-              <w:t>Học vai trò compiler, assembler, linker, ELF và reset/startup gắn với firmware C.</w:t>
+              <w:t>Học sâu register file: hai đọc/một ghi, write enable, clock, x0, write-back.</w:t>
             </w:r>
           </w:p>
         </w:tc>
@@ -875,13 +821,13 @@
           </w:tcPr>
           <w:p>
             <w:pPr>
-              <w:spacing w:after="80"/>
+              <w:spacing w:after="60"/>
             </w:pPr>
             <w:r>
               <w:rPr>
                 <w:sz w:val="20"/>
               </w:rPr>
-              <w:t>Giải thích đường đi từ mã C tới chương trình chạy; ví dụ đối chiếu khi có công cụ.</w:t>
+              <w:t>Sơ đồ giao diện, thử giữ/ghi thanh ghi và trace một lệnh.</w:t>
             </w:r>
           </w:p>
         </w:tc>
@@ -896,13 +842,13 @@
           </w:tcPr>
           <w:p>
             <w:pPr>
-              <w:spacing w:after="80"/>
+              <w:spacing w:after="60"/>
             </w:pPr>
             <w:r>
               <w:rPr>
                 <w:sz w:val="20"/>
               </w:rPr>
-              <w:t>3 · Liên hệ thiết kế</w:t>
+              <w:t>3</w:t>
             </w:r>
           </w:p>
         </w:tc>
@@ -912,13 +858,13 @@
           </w:tcPr>
           <w:p>
             <w:pPr>
-              <w:spacing w:after="80"/>
+              <w:spacing w:after="60"/>
             </w:pPr>
             <w:r>
               <w:rPr>
                 <w:sz w:val="20"/>
               </w:rPr>
-              <w:t>Đối chiếu khối trong Demo System; ghi kết quả thực hành nếu học viên đã chạy.</w:t>
+              <w:t>Khi đường tính toán đã rõ, khảo sát instruction memory so với data memory và load/store.</w:t>
             </w:r>
           </w:p>
         </w:tc>
@@ -928,13 +874,13 @@
           </w:tcPr>
           <w:p>
             <w:pPr>
-              <w:spacing w:after="80"/>
+              <w:spacing w:after="60"/>
             </w:pPr>
             <w:r>
               <w:rPr>
                 <w:sz w:val="20"/>
               </w:rPr>
-              <w:t>Một sơ đồ có nguồn và danh sách câu hỏi; log thực nghiệm chỉ bổ sung khi đã có.</w:t>
+              <w:t>Đề xuất giao diện data memory và bài kiểm thử; không tự coi đã có trong bản hiện tại.</w:t>
             </w:r>
           </w:p>
         </w:tc>
@@ -951,19 +897,19 @@
     </w:p>
     <w:p>
       <w:r>
-        <w:t>Xin góp ý phạm vi baseline Phase 1, chiều sâu kiến thức kiến trúc cần đạt và đầu ra thực nghiệm nên ưu tiên. Xin xác nhận yêu cầu hình thức báo cáo tuần và điều kiện board có thể sử dụng.</w:t>
+        <w:t>Xin góp ý phạm vi hai khối Decode/ALU cho tuần này, thứ tự mở rộng mô hình lớp, và tập lệnh tối thiểu cần đạt trước khi học memory/branch. Phản hồi GVHD và điều chỉnh: [Bổ sung sau buổi trao đổi].</w:t>
       </w:r>
     </w:p>
     <w:p>
       <w:r>
-        <w:t>Phản hồi GVHD / việc điều chỉnh sau buổi báo cáo: [Bổ sung].</w:t>
+        <w:t>Nguồn: file RiscVComputer_T3.circ do học viên cung cấp; đặc tả RV32I; Ibex decoder/ALU/register_file_ff tại pin Demo System. Chi tiết URL, revision và phạm vi đọc trong bài Word đi kèm. Báo cáo chưa gửi GVHD.</w:t>
       </w:r>
     </w:p>
     <w:sectPr>
       <w:headerReference w:type="default" r:id="rId9"/>
       <w:footerReference w:type="default" r:id="rId10"/>
       <w:pgSz w:w="11906" w:h="16838"/>
-      <w:pgMar w:top="1020" w:right="1134" w:bottom="964" w:left="1134" w:header="720" w:footer="720" w:gutter="0"/>
+      <w:pgMar w:top="964" w:right="1134" w:bottom="907" w:left="1134" w:header="720" w:footer="720" w:gutter="0"/>
       <w:cols w:space="720"/>
       <w:docGrid w:linePitch="360"/>
     </w:sectPr>
@@ -993,7 +939,7 @@
       <w:pStyle w:val="Caption"/>
     </w:pPr>
     <w:r>
-      <w:t>NGUYỄN HẢI MINH  |  RISC-V IBEX · PHASE 1</w:t>
+      <w:t>NGUYỄN HẢI MINH  |  KIẾN TRÚC MÁY TÍNH · RISC-V</w:t>
     </w:r>
   </w:p>
 </w:hdr>
@@ -1363,7 +1309,7 @@
     <w:qFormat/>
     <w:rsid w:val="00FC693F"/>
     <w:pPr>
-      <w:spacing w:after="120" w:line="259" w:lineRule="auto"/>
+      <w:spacing w:after="100" w:line="252" w:lineRule="auto"/>
     </w:pPr>
     <w:rPr>
       <w:rFonts w:ascii="Calibri" w:hAnsi="Calibri"/>
@@ -1425,7 +1371,7 @@
     <w:pPr>
       <w:keepNext/>
       <w:keepLines/>
-      <w:spacing w:before="480" w:after="0"/>
+      <w:spacing w:before="180" w:after="100"/>
       <w:outlineLvl w:val="0"/>
     </w:pPr>
     <w:rPr>
@@ -1433,7 +1379,7 @@
       <w:b/>
       <w:bCs/>
       <w:color w:val="17365D"/>
-      <w:sz w:val="30"/>
+      <w:sz w:val="28"/>
       <w:szCs w:val="28"/>
     </w:rPr>
   </w:style>
@@ -1449,7 +1395,7 @@
     <w:pPr>
       <w:keepNext/>
       <w:keepLines/>
-      <w:spacing w:before="200" w:after="0"/>
+      <w:spacing w:before="180" w:after="100"/>
       <w:outlineLvl w:val="1"/>
     </w:pPr>
     <w:rPr>
@@ -1714,7 +1660,7 @@
       <w:pBdr>
         <w:bottom w:val="single" w:sz="8" w:space="4" w:color="4F81BD" w:themeColor="accent1"/>
       </w:pBdr>
-      <w:spacing w:after="300" w:line="240" w:lineRule="auto"/>
+      <w:spacing w:after="100" w:line="240" w:lineRule="auto" w:before="180"/>
       <w:contextualSpacing/>
     </w:pPr>
     <w:rPr>
@@ -1722,7 +1668,7 @@
       <w:color w:val="17365D"/>
       <w:spacing w:val="5"/>
       <w:kern w:val="28"/>
-      <w:sz w:val="46"/>
+      <w:sz w:val="44"/>
       <w:szCs w:val="52"/>
     </w:rPr>
   </w:style>

</xml_diff>